<commit_message>
feat: F-042 RPE pre-fill, registro mercantil field, PDF viewer, checklist icons
- F-042 template: injected ${empresa_rpe} token so RPE auto-fills from /empresa
- Removed rpe_vence field (RPE doesn't expire), removed expiry warning
- Added "No. Registro Mercantil" field replacing rpe_vence in empresa profile
- Checklist actions replaced with heroicons (link, pencil, trash)
- Generated forms: added PDF view-in-browser via LibreOffice conversion + cache
- Download still serves original .docx, view opens converted PDF in new tab

Co-Authored-By: Claude Opus 4.6 <noreply@anthropic.com>
</commit_message>
<xml_diff>
--- a/resources/form_templates/estandar/SNCC_F042_Informacion_Oferente.docx
+++ b/resources/form_templates/estandar/SNCC_F042_Informacion_Oferente.docx
@@ -2083,27 +2083,12 @@
             </w:r>
             <w:r>
               <w:rPr>
-                <w:i/>
-                <w:iCs/>
-                <w:color w:val="FF0000"/>
                 <w:spacing w:val="-2"/>
                 <w:sz w:val="22"/>
                 <w:szCs w:val="22"/>
                 <w:lang w:val="es-DO"/>
               </w:rPr>
-              <w:t>[indicar el nú</w:t>
-            </w:r>
-            <w:r>
-              <w:rPr>
-                <w:i/>
-                <w:iCs/>
-                <w:color w:val="FF0000"/>
-                <w:spacing w:val="-2"/>
-                <w:sz w:val="22"/>
-                <w:szCs w:val="22"/>
-                <w:lang w:val="es-DO"/>
-              </w:rPr>
-              <w:t>mero del Registro de Proveedores del Estado]</w:t>
+              <w:t>${empresa_rpe}</w:t>
             </w:r>
           </w:p>
         </w:tc>

</xml_diff>